<commit_message>
Page every Supabase read: a silent 1,000-row cap was eating the newest data (#23)
The guide download chart stopped at 31 August while the table held rows
through 7 September. Supabase caps every REST response at 1,000 rows
after the query's own limit, with HTTP 200 and no marker, and returns
rows in physical order, so the rows lost are always the newest.

guide-dl: 145 rows in the table, 137 on the chart, the gap exactly the
eight September rows. asset-stats.js was seeing 1,000 of 2,031.

api/_sb-fetch.js pages with Range headers. Twelve files and twenty-two
reads converted; twenty of them were latent, not yet wrong.

check_no_endpoint_relies_on_an_uncapped_limit fails on any api/ read
declaring a limit above the cap without paging, demonstrated to fire at
20 findings against the pre-fix tree.

Also carries the three surgical cover-letter corrections, which are
research/ and not deployed.

126 checks, 0 failed. All 55 api modules parse.
</commit_message>
<xml_diff>
--- a/research/aie_submission_2026-09-01/03_Cover_Letter.docx
+++ b/research/aie_submission_2026-09-01/03_Cover_Letter.docx
@@ -16,7 +16,7 @@
         <w:spacing w:after="140"/>
       </w:pPr>
       <w:r>
-        <w:t xml:space="preserve">6 September 2026</w:t>
+        <w:t xml:space="preserve">September 6, 2026</w:t>
       </w:r>
     </w:p>
     <w:p>
@@ -82,7 +82,7 @@
         <w:t xml:space="preserve">Submission details.</w:t>
       </w:r>
       <w:r>
-        <w:t xml:space="preserve"> Article type: original research. Length approximately 10,900 words, excluding tables and references. Nine tables, no figures, three appendices and 35 references. Two authors, Phillip Wikes and Ubayet Hossain, FRM. Corresponding author Phillip Wikes, info@jrsstandard.com. Neither author holds an institutional affiliation and both contributed in a personal professional capacity.</w:t>
+        <w:t xml:space="preserve"> Article type: original research. Length approximately 10,900 words, excluding tables and references. Nine tables, no figures, three appendices and 35 references. Two authors, Phillip Wikes and Ubayet Hossain, FRM. Corresponding author Phillip Wikes, info@jrsstandard.com.</w:t>
       </w:r>
     </w:p>
     <w:p>
@@ -166,7 +166,7 @@
         <w:t xml:space="preserve">Anonymisation.</w:t>
       </w:r>
       <w:r>
-        <w:t xml:space="preserve"> The manuscript has been anonymised for double-blind review. Author names, affiliations, the named contributor roster and the acknowledgements are on the separate title page.</w:t>
+        <w:t xml:space="preserve"> The manuscript has been anonymised for double-anonymous review. Author-identifying information has been provided separately through the submission system.</w:t>
       </w:r>
     </w:p>
     <w:p>

</xml_diff>

<commit_message>
Close all three open items: chart alignment, as-of stamp, one-page cover letter (#26)
The endorsements chart had the identical two-scroller defect fixed in
the downloads chart, unbitten only because its series still fits the
viewport. Rebuilt to one scroll container with the date inside the same
element as its bar.

An as-of stamp on both charts, from a single asOfLine() helper: a chart
rendering correct data and one showing a stale view look identical, and
a backgrounded phone suspends the 60-second refresh.

The cover letter is one page, fixed in the generator. md_to_docx.py
gains hard line breaks and per-document layout declared in the file
itself, because making spacing or margins global would have fixed the
letter by damaging the manuscript. Proved non-invasive: the manuscript
and title page regenerate to byte-identical document.xml under old code
and new. Every approved word is intact.

126 checks, 0 failed.
</commit_message>
<xml_diff>
--- a/research/aie_submission_2026-09-01/03_Cover_Letter.docx
+++ b/research/aie_submission_2026-09-01/03_Cover_Letter.docx
@@ -4,16 +4,7 @@
   <w:body>
     <w:p>
       <w:pPr>
-        <w:pStyle w:val="Heading1"/>
-        <w:spacing w:after="140"/>
-      </w:pPr>
-      <w:r>
-        <w:t xml:space="preserve">Cover letter</w:t>
-      </w:r>
-    </w:p>
-    <w:p>
-      <w:pPr>
-        <w:spacing w:after="140"/>
+        <w:spacing w:after="70"/>
       </w:pPr>
       <w:r>
         <w:t xml:space="preserve">September 6, 2026</w:t>
@@ -21,34 +12,30 @@
     </w:p>
     <w:p>
       <w:pPr>
-        <w:spacing w:after="140"/>
+        <w:spacing w:after="70"/>
       </w:pPr>
       <w:r>
         <w:t xml:space="preserve">The Editors</w:t>
       </w:r>
-    </w:p>
-    <w:p>
-      <w:pPr>
-        <w:spacing w:after="140"/>
-      </w:pPr>
+      <w:r>
+        <w:br/>
+      </w:r>
       <w:r>
         <w:rPr>
           <w:i/>
         </w:rPr>
         <w:t xml:space="preserve">AI and Ethics</w:t>
       </w:r>
-    </w:p>
-    <w:p>
-      <w:pPr>
-        <w:spacing w:after="140"/>
-      </w:pPr>
+      <w:r>
+        <w:br/>
+      </w:r>
       <w:r>
         <w:t xml:space="preserve">Springer Nature</w:t>
       </w:r>
     </w:p>
     <w:p>
       <w:pPr>
-        <w:spacing w:after="140"/>
+        <w:spacing w:after="70"/>
       </w:pPr>
       <w:r>
         <w:t xml:space="preserve">Dear Editors,</w:t>
@@ -56,7 +43,7 @@
     </w:p>
     <w:p>
       <w:pPr>
-        <w:spacing w:after="140"/>
+        <w:spacing w:after="70"/>
       </w:pPr>
       <w:r>
         <w:t xml:space="preserve">We submit </w:t>
@@ -73,7 +60,7 @@
     </w:p>
     <w:p>
       <w:pPr>
-        <w:spacing w:after="140"/>
+        <w:spacing w:after="70"/>
       </w:pPr>
       <w:r>
         <w:rPr>
@@ -87,7 +74,7 @@
     </w:p>
     <w:p>
       <w:pPr>
-        <w:spacing w:after="140"/>
+        <w:spacing w:after="70"/>
       </w:pPr>
       <w:r>
         <w:rPr>
@@ -101,7 +88,7 @@
     </w:p>
     <w:p>
       <w:pPr>
-        <w:spacing w:after="140"/>
+        <w:spacing w:after="70"/>
       </w:pPr>
       <w:r>
         <w:rPr>
@@ -115,7 +102,7 @@
     </w:p>
     <w:p>
       <w:pPr>
-        <w:spacing w:after="140"/>
+        <w:spacing w:after="70"/>
       </w:pPr>
       <w:r>
         <w:rPr>
@@ -129,7 +116,7 @@
     </w:p>
     <w:p>
       <w:pPr>
-        <w:spacing w:after="140"/>
+        <w:spacing w:after="70"/>
       </w:pPr>
       <w:r>
         <w:rPr>
@@ -143,7 +130,7 @@
     </w:p>
     <w:p>
       <w:pPr>
-        <w:spacing w:after="140"/>
+        <w:spacing w:after="70"/>
       </w:pPr>
       <w:r>
         <w:rPr>
@@ -157,7 +144,7 @@
     </w:p>
     <w:p>
       <w:pPr>
-        <w:spacing w:after="140"/>
+        <w:spacing w:after="70"/>
       </w:pPr>
       <w:r>
         <w:rPr>
@@ -171,7 +158,7 @@
     </w:p>
     <w:p>
       <w:pPr>
-        <w:spacing w:after="140"/>
+        <w:spacing w:after="70"/>
       </w:pPr>
       <w:r>
         <w:t xml:space="preserve">We would be glad to supply the corpus, the reference classification, the reviewer instructions and the analysis scripts to reviewers on request.</w:t>
@@ -179,7 +166,7 @@
     </w:p>
     <w:p>
       <w:pPr>
-        <w:spacing w:after="140"/>
+        <w:spacing w:after="70"/>
       </w:pPr>
       <w:r>
         <w:t xml:space="preserve">Thank you for considering the manuscript.</w:t>
@@ -187,7 +174,7 @@
     </w:p>
     <w:p>
       <w:pPr>
-        <w:spacing w:after="140"/>
+        <w:spacing w:after="70"/>
       </w:pPr>
       <w:r>
         <w:t xml:space="preserve">Yours sincerely,</w:t>
@@ -195,7 +182,7 @@
     </w:p>
     <w:p>
       <w:pPr>
-        <w:spacing w:after="140"/>
+        <w:spacing w:after="70"/>
       </w:pPr>
       <w:r>
         <w:rPr>
@@ -203,34 +190,28 @@
         </w:rPr>
         <w:t xml:space="preserve">Phillip Wikes</w:t>
       </w:r>
-    </w:p>
-    <w:p>
-      <w:pPr>
-        <w:spacing w:after="140"/>
-      </w:pPr>
+      <w:r>
+        <w:br/>
+      </w:r>
       <w:r>
         <w:t xml:space="preserve">Corresponding author, on behalf of both authors</w:t>
       </w:r>
-    </w:p>
-    <w:p>
-      <w:pPr>
-        <w:spacing w:after="140"/>
-      </w:pPr>
+      <w:r>
+        <w:br/>
+      </w:r>
       <w:r>
         <w:t xml:space="preserve">Creator of the Justification Review Standard</w:t>
       </w:r>
-    </w:p>
-    <w:p>
-      <w:pPr>
-        <w:spacing w:after="140"/>
-      </w:pPr>
+      <w:r>
+        <w:br/>
+      </w:r>
       <w:r>
         <w:t xml:space="preserve">info@jrsstandard.com</w:t>
       </w:r>
     </w:p>
     <w:sectPr>
       <w:pgSz w:w="12240" w:h="15840"/>
-      <w:pgMar w:top="1440" w:right="1440" w:bottom="1440" w:left="1440"/>
+      <w:pgMar w:top="1080" w:right="1080" w:bottom="1080" w:left="1080"/>
     </w:sectPr>
   </w:body>
 </w:document>

</xml_diff>